<commit_message>
Update the snapshot (2026-10-17 01:40)
Co-Authored-By: Claude Opus 5.5 <noreply@anthropic.com>
</commit_message>
<xml_diff>
--- a/docs/paper/paper.docx
+++ b/docs/paper/paper.docx
@@ -6,26 +6,33 @@
       <w:pPr>
         <w:rPr>
           <w:lang w:eastAsia="ja-JP"/>
-        </w:rPr>
-      </w:pPr>
-      <w:r>
-        <w:rPr>
-          <w:lang w:eastAsia="ja-JP"/>
-        </w:rPr>
-        <w:t>監修済み（</w:t>
-      </w:r>
-      <w:r>
-        <w:rPr>
-          <w:lang w:eastAsia="ja-JP"/>
-        </w:rPr>
-        <w:t>2026-10-13</w:t>
-      </w:r>
-      <w:r>
-        <w:rPr>
-          <w:lang w:eastAsia="ja-JP"/>
-        </w:rPr>
-        <w:t>、利用者が編集した版。論文の筋と結果はこの文書を是とする）</w:t>
-      </w:r>
+          <w:del w:id="90004" w:author="Claude" w:date="2026-10-16T05:22:32Z"/>
+        </w:rPr>
+      </w:pPr>
+      <w:del w:id="90001" w:author="Claude" w:date="2026-10-16T05:22:32Z">
+        <w:r>
+          <w:rPr>
+            <w:lang w:eastAsia="ja-JP"/>
+          </w:rPr>
+          <w:delText>監修済み（</w:delText>
+        </w:r>
+      </w:del>
+      <w:del w:id="90002" w:author="Claude" w:date="2026-10-16T05:22:32Z">
+        <w:r>
+          <w:rPr>
+            <w:lang w:eastAsia="ja-JP"/>
+          </w:rPr>
+          <w:delText>2026-10-13</w:delText>
+        </w:r>
+      </w:del>
+      <w:del w:id="90003" w:author="Claude" w:date="2026-10-16T05:22:32Z">
+        <w:r>
+          <w:rPr>
+            <w:lang w:eastAsia="ja-JP"/>
+          </w:rPr>
+          <w:delText>、利用者が編集した版。論文の筋と結果はこの文書を是とする）</w:delText>
+        </w:r>
+      </w:del>
     </w:p>
     <w:p>
       <w:pPr>

</xml_diff>